<commit_message>
Sync EAAI submission files (user-edited title pages, declaration)
Co-Authored-By: Claude Opus 4.6 (1M context) <noreply@anthropic.com>
</commit_message>
<xml_diff>
--- a/papers/cfd_visual_qa/latex/files_for_submission/eaai_submission/title_page_.docx
+++ b/papers/cfd_visual_qa/latex/files_for_submission/eaai_submission/title_page_.docx
@@ -51,7 +51,29 @@
           <w:szCs w:val="28"/>
           <w:lang w:eastAsia="ko-KR"/>
         </w:rPr>
-        <w:t>Can Vision-Language Models Evaluate CFD? A Benchmark for Physical Plausibility Assessment of Flow Field Visualizations</w:t>
+        <w:t>Can Vision-Language Models Evaluate C</w:t>
+      </w:r>
+      <w:r>
+        <w:rPr>
+          <w:rFonts w:ascii="Times New Roman" w:hAnsi="Times New Roman" w:cs="Times New Roman" w:hint="eastAsia"/>
+          <w:b/>
+          <w:bCs/>
+          <w:sz w:val="28"/>
+          <w:szCs w:val="28"/>
+          <w:lang w:eastAsia="ko-KR"/>
+        </w:rPr>
+        <w:t>omputational Fluid Dynamics</w:t>
+      </w:r>
+      <w:r>
+        <w:rPr>
+          <w:rFonts w:ascii="Times New Roman" w:eastAsia="Times New Roman" w:hAnsi="Times New Roman" w:cs="Times New Roman"/>
+          <w:b/>
+          <w:bCs/>
+          <w:sz w:val="28"/>
+          <w:szCs w:val="28"/>
+          <w:lang w:eastAsia="ko-KR"/>
+        </w:rPr>
+        <w:t>? A Benchmark for Physical Plausibility Assessment of Flow Field Visualizations</w:t>
       </w:r>
     </w:p>
     <w:p>
@@ -119,31 +141,7 @@
           <w:vertAlign w:val="superscript"/>
           <w:lang w:eastAsia="ko-KR"/>
         </w:rPr>
-        <w:t xml:space="preserve"> </w:t>
-      </w:r>
-      <w:proofErr w:type="spellStart"/>
-      <w:proofErr w:type="gramStart"/>
-      <w:r>
-        <w:rPr>
-          <w:rFonts w:ascii="Times New Roman" w:eastAsia="Times New Roman" w:hAnsi="Times New Roman" w:cs="Times New Roman"/>
-          <w:sz w:val="24"/>
-          <w:szCs w:val="24"/>
-          <w:vertAlign w:val="superscript"/>
-          <w:lang w:eastAsia="ko-KR"/>
-        </w:rPr>
-        <w:t>a,b</w:t>
-      </w:r>
-      <w:proofErr w:type="spellEnd"/>
-      <w:proofErr w:type="gramEnd"/>
-      <w:r>
-        <w:rPr>
-          <w:rFonts w:ascii="Times New Roman" w:eastAsia="Times New Roman" w:hAnsi="Times New Roman" w:cs="Times New Roman"/>
-          <w:sz w:val="24"/>
-          <w:szCs w:val="24"/>
-          <w:vertAlign w:val="superscript"/>
-          <w:lang w:eastAsia="ko-KR"/>
-        </w:rPr>
-        <w:t>,*</w:t>
+        <w:t xml:space="preserve"> a,b,*</w:t>
       </w:r>
     </w:p>
     <w:p>
@@ -182,8 +180,6 @@
           <w:lang w:eastAsia="ko-KR"/>
         </w:rPr>
       </w:pPr>
-      <w:proofErr w:type="spellStart"/>
-      <w:proofErr w:type="gramStart"/>
       <w:r>
         <w:rPr>
           <w:rFonts w:ascii="Times New Roman" w:eastAsia="Times New Roman" w:hAnsi="Times New Roman" w:cs="Times New Roman"/>
@@ -194,8 +190,6 @@
         </w:rPr>
         <w:t>a</w:t>
       </w:r>
-      <w:proofErr w:type="spellEnd"/>
-      <w:proofErr w:type="gramEnd"/>
       <w:r>
         <w:rPr>
           <w:rFonts w:ascii="Times New Roman" w:eastAsia="Times New Roman" w:hAnsi="Times New Roman" w:cs="Times New Roman"/>
@@ -203,47 +197,7 @@
           <w:szCs w:val="20"/>
           <w:lang w:eastAsia="ko-KR"/>
         </w:rPr>
-        <w:t xml:space="preserve"> Energy Efficiency Research Division, Korea Institute of Energy Research, 152 </w:t>
-      </w:r>
-      <w:proofErr w:type="spellStart"/>
-      <w:r>
-        <w:rPr>
-          <w:rFonts w:ascii="Times New Roman" w:eastAsia="Times New Roman" w:hAnsi="Times New Roman" w:cs="Times New Roman"/>
-          <w:sz w:val="20"/>
-          <w:szCs w:val="20"/>
-          <w:lang w:eastAsia="ko-KR"/>
-        </w:rPr>
-        <w:t>Gajeong-ro</w:t>
-      </w:r>
-      <w:proofErr w:type="spellEnd"/>
-      <w:r>
-        <w:rPr>
-          <w:rFonts w:ascii="Times New Roman" w:eastAsia="Times New Roman" w:hAnsi="Times New Roman" w:cs="Times New Roman"/>
-          <w:sz w:val="20"/>
-          <w:szCs w:val="20"/>
-          <w:lang w:eastAsia="ko-KR"/>
-        </w:rPr>
-        <w:t xml:space="preserve">, </w:t>
-      </w:r>
-      <w:proofErr w:type="spellStart"/>
-      <w:r>
-        <w:rPr>
-          <w:rFonts w:ascii="Times New Roman" w:eastAsia="Times New Roman" w:hAnsi="Times New Roman" w:cs="Times New Roman"/>
-          <w:sz w:val="20"/>
-          <w:szCs w:val="20"/>
-          <w:lang w:eastAsia="ko-KR"/>
-        </w:rPr>
-        <w:t>Yuseong-gu</w:t>
-      </w:r>
-      <w:proofErr w:type="spellEnd"/>
-      <w:r>
-        <w:rPr>
-          <w:rFonts w:ascii="Times New Roman" w:eastAsia="Times New Roman" w:hAnsi="Times New Roman" w:cs="Times New Roman"/>
-          <w:sz w:val="20"/>
-          <w:szCs w:val="20"/>
-          <w:lang w:eastAsia="ko-KR"/>
-        </w:rPr>
-        <w:t>, Daejeon 34129, Republic of Korea</w:t>
+        <w:t xml:space="preserve"> Energy Efficiency Research Division, Korea Institute of Energy Research, 152 Gajeong-ro, Yuseong-gu, Daejeon 34129, Republic of Korea</w:t>
       </w:r>
     </w:p>
     <w:p>
@@ -277,47 +231,7 @@
           <w:szCs w:val="20"/>
           <w:lang w:eastAsia="ko-KR"/>
         </w:rPr>
-        <w:t xml:space="preserve"> Energy Engineering, University of Science &amp; Technology, 217 </w:t>
-      </w:r>
-      <w:proofErr w:type="spellStart"/>
-      <w:r>
-        <w:rPr>
-          <w:rFonts w:ascii="Times New Roman" w:eastAsia="Times New Roman" w:hAnsi="Times New Roman" w:cs="Times New Roman"/>
-          <w:sz w:val="20"/>
-          <w:szCs w:val="20"/>
-          <w:lang w:eastAsia="ko-KR"/>
-        </w:rPr>
-        <w:t>Gajeong-ro</w:t>
-      </w:r>
-      <w:proofErr w:type="spellEnd"/>
-      <w:r>
-        <w:rPr>
-          <w:rFonts w:ascii="Times New Roman" w:eastAsia="Times New Roman" w:hAnsi="Times New Roman" w:cs="Times New Roman"/>
-          <w:sz w:val="20"/>
-          <w:szCs w:val="20"/>
-          <w:lang w:eastAsia="ko-KR"/>
-        </w:rPr>
-        <w:t xml:space="preserve">, </w:t>
-      </w:r>
-      <w:proofErr w:type="spellStart"/>
-      <w:r>
-        <w:rPr>
-          <w:rFonts w:ascii="Times New Roman" w:eastAsia="Times New Roman" w:hAnsi="Times New Roman" w:cs="Times New Roman"/>
-          <w:sz w:val="20"/>
-          <w:szCs w:val="20"/>
-          <w:lang w:eastAsia="ko-KR"/>
-        </w:rPr>
-        <w:t>Yuseong-gu</w:t>
-      </w:r>
-      <w:proofErr w:type="spellEnd"/>
-      <w:r>
-        <w:rPr>
-          <w:rFonts w:ascii="Times New Roman" w:eastAsia="Times New Roman" w:hAnsi="Times New Roman" w:cs="Times New Roman"/>
-          <w:sz w:val="20"/>
-          <w:szCs w:val="20"/>
-          <w:lang w:eastAsia="ko-KR"/>
-        </w:rPr>
-        <w:t>, Daejeon 34129, Republic of Korea</w:t>
+        <w:t xml:space="preserve"> Energy Engineering, University of Science &amp; Technology, 217 Gajeong-ro, Yuseong-gu, Daejeon 34129, Republic of Korea</w:t>
       </w:r>
     </w:p>
     <w:p>
@@ -1476,6 +1390,7 @@
   <w:style w:type="character" w:default="1" w:styleId="a0">
     <w:name w:val="Default Paragraph Font"/>
     <w:uiPriority w:val="1"/>
+    <w:semiHidden/>
     <w:unhideWhenUsed/>
   </w:style>
   <w:style w:type="table" w:default="1" w:styleId="a1">

</xml_diff>